<commit_message>
feat(oficios): permitir escolher gabinete de destino e destinatário do ofício
Adiciona o campo destino_gabinete no Ofício (Gabinete do Delegado-Geral
Adjunto ou Gabinete do Delegado-Geral), com pickers de destinatário por
gabinete na tela de Configurações (reaproveitando o cadastro de Servidor,
que já aceita nome, cargo e unidade sem exigir RG/CPF). O rodapé do
oficio.docx e o contexto do docxtpl passam a montar o "Exmo. Sr." e a
linha DESTINO dinamicamente a partir da escolha feita no ofício, em vez
do nome fixo do Delegado-Geral Adjunto.

Corrige também um bug em _assinatura_nome_cargo que, ao consultar um tipo
de assinatura sem configuração própria, vazava o assinante de outro tipo.
</commit_message>
<xml_diff>
--- a/documentos/resources/oficio.docx
+++ b/documentos/resources/oficio.docx
@@ -1817,7 +1817,7 @@
         <w:sz w:val="16"/>
         <w:szCs w:val="16"/>
       </w:rPr>
-      <w:t xml:space="preserve">DR. RIAD BRAGA FARHAT  </w:t>
+      <w:t xml:space="preserve">DR. {{nome_destinatario}}  </w:t>
     </w:r>
   </w:p>
   <w:p xmlns:wp14="http://schemas.microsoft.com/office/word/2010/wordml" wp14:textId="77777777">
@@ -1840,7 +1840,7 @@
         <w:sz w:val="16"/>
         <w:szCs w:val="16"/>
       </w:rPr>
-      <w:t xml:space="preserve">MD. DELEGADO GERAL ADJUNTO </w:t>
+      <w:t xml:space="preserve">MD. {{cargo_destinatario}} </w:t>
     </w:r>
   </w:p>
   <w:p xmlns:wp14="http://schemas.microsoft.com/office/word/2010/wordml" wp14:textId="77777777">

</xml_diff>